<commit_message>
use new match result template
</commit_message>
<xml_diff>
--- a/src/main/resources/pictures/template/men/ResultTemp.docx
+++ b/src/main/resources/pictures/template/men/ResultTemp.docx
@@ -3,6 +3,239 @@
 <w:document xmlns:wpc="http://schemas.microsoft.com/office/word/2010/wordprocessingCanvas" xmlns:cx="http://schemas.microsoft.com/office/drawing/2014/chartex" xmlns:cx1="http://schemas.microsoft.com/office/drawing/2015/9/8/chartex" xmlns:cx2="http://schemas.microsoft.com/office/drawing/2015/10/21/chartex" xmlns:cx3="http://schemas.microsoft.com/office/drawing/2016/5/9/chartex" xmlns:cx4="http://schemas.microsoft.com/office/drawing/2016/5/10/chartex" xmlns:cx5="http://schemas.microsoft.com/office/drawing/2016/5/11/chartex" xmlns:cx6="http://schemas.microsoft.com/office/drawing/2016/5/12/chartex" xmlns:cx7="http://schemas.microsoft.com/office/drawing/2016/5/13/chartex" xmlns:cx8="http://schemas.microsoft.com/office/drawing/2016/5/14/chartex" xmlns:mc="http://schemas.openxmlformats.org/markup-compatibility/2006" xmlns:aink="http://schemas.microsoft.com/office/drawing/2016/ink" xmlns:am3d="http://schemas.microsoft.com/office/drawing/2017/model3d" xmlns:o="urn:schemas-microsoft-com:office:office" xmlns:oel="http://schemas.microsoft.com/office/2019/extlst" xmlns:r="http://schemas.openxmlformats.org/officeDocument/2006/relationships" xmlns:m="http://schemas.openxmlformats.org/officeDocument/2006/math" xmlns:v="urn:schemas-microsoft-com:vml" xmlns:wp14="http://schemas.microsoft.com/office/word/2010/wordprocessingDrawing" xmlns:wp="http://schemas.openxmlformats.org/drawingml/2006/wordprocessingDrawing" xmlns:w10="urn:schemas-microsoft-com:office:word" xmlns:w="http://schemas.openxmlformats.org/wordprocessingml/2006/main" xmlns:w14="http://schemas.microsoft.com/office/word/2010/wordml" xmlns:w15="http://schemas.microsoft.com/office/word/2012/wordml" xmlns:w16cex="http://schemas.microsoft.com/office/word/2018/wordml/cex" xmlns:w16cid="http://schemas.microsoft.com/office/word/2016/wordml/cid" xmlns:w16="http://schemas.microsoft.com/office/word/2018/wordml" xmlns:w16du="http://schemas.microsoft.com/office/word/2023/wordml/word16du" xmlns:w16sdtdh="http://schemas.microsoft.com/office/word/2020/wordml/sdtdatahash" xmlns:w16sdtfl="http://schemas.microsoft.com/office/word/2024/wordml/sdtformatlock" xmlns:w16se="http://schemas.microsoft.com/office/word/2015/wordml/symex" xmlns:wpg="http://schemas.microsoft.com/office/word/2010/wordprocessingGroup" xmlns:wpi="http://schemas.microsoft.com/office/word/2010/wordprocessingInk" xmlns:wne="http://schemas.microsoft.com/office/word/2006/wordml" xmlns:wps="http://schemas.microsoft.com/office/word/2010/wordprocessingShape" mc:Ignorable="w14 w15 w16se w16cid w16 w16cex w16sdtdh w16sdtfl w16du wp14">
   <w:body>
     <w:p>
+      <w:r>
+        <w:rPr>
+          <w:noProof/>
+        </w:rPr>
+        <w:drawing>
+          <wp:anchor distT="0" distB="0" distL="114300" distR="114300" simplePos="0" relativeHeight="251662336" behindDoc="0" locked="0" layoutInCell="1" allowOverlap="1" wp14:anchorId="0063501E" wp14:editId="33F92A5B">
+            <wp:simplePos x="0" y="0"/>
+            <wp:positionH relativeFrom="page">
+              <wp:posOffset>-95250</wp:posOffset>
+            </wp:positionH>
+            <wp:positionV relativeFrom="paragraph">
+              <wp:posOffset>-3405505</wp:posOffset>
+            </wp:positionV>
+            <wp:extent cx="10439400" cy="15434310"/>
+            <wp:effectExtent l="0" t="0" r="0" b="0"/>
+            <wp:wrapNone/>
+            <wp:docPr id="1037487974" name="Grafik 3"/>
+            <wp:cNvGraphicFramePr>
+              <a:graphicFrameLocks xmlns:a="http://schemas.openxmlformats.org/drawingml/2006/main" noChangeAspect="1"/>
+            </wp:cNvGraphicFramePr>
+            <a:graphic xmlns:a="http://schemas.openxmlformats.org/drawingml/2006/main">
+              <a:graphicData uri="http://schemas.openxmlformats.org/drawingml/2006/picture">
+                <pic:pic xmlns:pic="http://schemas.openxmlformats.org/drawingml/2006/picture">
+                  <pic:nvPicPr>
+                    <pic:cNvPr id="1037487974" name="Grafik 3"/>
+                    <pic:cNvPicPr/>
+                  </pic:nvPicPr>
+                  <pic:blipFill>
+                    <a:blip r:embed="rId7">
+                      <a:alphaModFix amt="70000"/>
+                      <a:extLst>
+                        <a:ext uri="{28A0092B-C50C-407E-A947-70E740481C1C}">
+                          <a14:useLocalDpi xmlns:a14="http://schemas.microsoft.com/office/drawing/2010/main" val="0"/>
+                        </a:ext>
+                      </a:extLst>
+                    </a:blip>
+                    <a:stretch>
+                      <a:fillRect/>
+                    </a:stretch>
+                  </pic:blipFill>
+                  <pic:spPr>
+                    <a:xfrm>
+                      <a:off x="0" y="0"/>
+                      <a:ext cx="10439400" cy="15434310"/>
+                    </a:xfrm>
+                    <a:prstGeom prst="rect">
+                      <a:avLst/>
+                    </a:prstGeom>
+                  </pic:spPr>
+                </pic:pic>
+              </a:graphicData>
+            </a:graphic>
+            <wp14:sizeRelH relativeFrom="page">
+              <wp14:pctWidth>0</wp14:pctWidth>
+            </wp14:sizeRelH>
+            <wp14:sizeRelV relativeFrom="page">
+              <wp14:pctHeight>0</wp14:pctHeight>
+            </wp14:sizeRelV>
+          </wp:anchor>
+        </w:drawing>
+      </w:r>
+      <w:r>
+        <w:rPr>
+          <w:noProof/>
+        </w:rPr>
+        <mc:AlternateContent>
+          <mc:Choice Requires="wpg">
+            <w:drawing>
+              <wp:anchor distT="0" distB="0" distL="114300" distR="114300" simplePos="0" relativeHeight="251661312" behindDoc="1" locked="0" layoutInCell="1" allowOverlap="1" wp14:anchorId="095C5D59" wp14:editId="33BDBF51">
+                <wp:simplePos x="0" y="0"/>
+                <wp:positionH relativeFrom="column">
+                  <wp:posOffset>-1490739</wp:posOffset>
+                </wp:positionH>
+                <wp:positionV relativeFrom="paragraph">
+                  <wp:posOffset>-3428496</wp:posOffset>
+                </wp:positionV>
+                <wp:extent cx="10416277" cy="18159657"/>
+                <wp:effectExtent l="0" t="0" r="4445" b="0"/>
+                <wp:wrapNone/>
+                <wp:docPr id="277136787" name="Gruppieren 2"/>
+                <wp:cNvGraphicFramePr/>
+                <a:graphic xmlns:a="http://schemas.openxmlformats.org/drawingml/2006/main">
+                  <a:graphicData uri="http://schemas.microsoft.com/office/word/2010/wordprocessingGroup">
+                    <wpg:wgp>
+                      <wpg:cNvGrpSpPr/>
+                      <wpg:grpSpPr>
+                        <a:xfrm>
+                          <a:off x="0" y="0"/>
+                          <a:ext cx="10416277" cy="18159657"/>
+                          <a:chOff x="54321" y="-2614033"/>
+                          <a:chExt cx="10416529" cy="18160094"/>
+                        </a:xfrm>
+                      </wpg:grpSpPr>
+                      <pic:pic xmlns:pic="http://schemas.openxmlformats.org/drawingml/2006/picture">
+                        <pic:nvPicPr>
+                          <pic:cNvPr id="359774929" name="Grafik 1"/>
+                          <pic:cNvPicPr>
+                            <a:picLocks noChangeAspect="1"/>
+                          </pic:cNvPicPr>
+                        </pic:nvPicPr>
+                        <pic:blipFill>
+                          <a:blip r:embed="rId8">
+                            <a:extLst>
+                              <a:ext uri="{28A0092B-C50C-407E-A947-70E740481C1C}">
+                                <a14:useLocalDpi xmlns:a14="http://schemas.microsoft.com/office/drawing/2010/main" val="0"/>
+                              </a:ext>
+                            </a:extLst>
+                          </a:blip>
+                          <a:srcRect/>
+                          <a:stretch/>
+                        </pic:blipFill>
+                        <pic:spPr>
+                          <a:xfrm>
+                            <a:off x="54322" y="-2614033"/>
+                            <a:ext cx="10416528" cy="18160094"/>
+                          </a:xfrm>
+                          <a:prstGeom prst="rect">
+                            <a:avLst/>
+                          </a:prstGeom>
+                        </pic:spPr>
+                      </pic:pic>
+                      <pic:pic xmlns:pic="http://schemas.openxmlformats.org/drawingml/2006/picture">
+                        <pic:nvPicPr>
+                          <pic:cNvPr id="1883932303" name="Grafik 1"/>
+                          <pic:cNvPicPr>
+                            <a:picLocks noChangeAspect="1"/>
+                          </pic:cNvPicPr>
+                        </pic:nvPicPr>
+                        <pic:blipFill>
+                          <a:blip r:embed="rId9">
+                            <a:extLst>
+                              <a:ext uri="{28A0092B-C50C-407E-A947-70E740481C1C}">
+                                <a14:useLocalDpi xmlns:a14="http://schemas.microsoft.com/office/drawing/2010/main" val="0"/>
+                              </a:ext>
+                            </a:extLst>
+                          </a:blip>
+                          <a:stretch>
+                            <a:fillRect/>
+                          </a:stretch>
+                        </pic:blipFill>
+                        <pic:spPr>
+                          <a:xfrm>
+                            <a:off x="973248" y="846499"/>
+                            <a:ext cx="1116965" cy="1117600"/>
+                          </a:xfrm>
+                          <a:prstGeom prst="rect">
+                            <a:avLst/>
+                          </a:prstGeom>
+                          <a:ln>
+                            <a:noFill/>
+                          </a:ln>
+                        </pic:spPr>
+                      </pic:pic>
+                      <pic:pic xmlns:pic="http://schemas.openxmlformats.org/drawingml/2006/picture">
+                        <pic:nvPicPr>
+                          <pic:cNvPr id="1632319248" name="Grafik 2"/>
+                          <pic:cNvPicPr>
+                            <a:picLocks noChangeAspect="1"/>
+                          </pic:cNvPicPr>
+                        </pic:nvPicPr>
+                        <pic:blipFill>
+                          <a:blip r:embed="rId10">
+                            <a:extLst>
+                              <a:ext uri="{28A0092B-C50C-407E-A947-70E740481C1C}">
+                                <a14:useLocalDpi xmlns:a14="http://schemas.microsoft.com/office/drawing/2010/main" val="0"/>
+                              </a:ext>
+                            </a:extLst>
+                          </a:blip>
+                          <a:stretch>
+                            <a:fillRect/>
+                          </a:stretch>
+                        </pic:blipFill>
+                        <pic:spPr>
+                          <a:xfrm>
+                            <a:off x="54321" y="54321"/>
+                            <a:ext cx="1692910" cy="1694180"/>
+                          </a:xfrm>
+                          <a:prstGeom prst="rect">
+                            <a:avLst/>
+                          </a:prstGeom>
+                          <a:ln>
+                            <a:noFill/>
+                          </a:ln>
+                        </pic:spPr>
+                      </pic:pic>
+                    </wpg:wgp>
+                  </a:graphicData>
+                </a:graphic>
+                <wp14:sizeRelH relativeFrom="margin">
+                  <wp14:pctWidth>0</wp14:pctWidth>
+                </wp14:sizeRelH>
+                <wp14:sizeRelV relativeFrom="margin">
+                  <wp14:pctHeight>0</wp14:pctHeight>
+                </wp14:sizeRelV>
+              </wp:anchor>
+            </w:drawing>
+          </mc:Choice>
+          <mc:Fallback>
+            <w:pict>
+              <v:group w14:anchorId="6D910680" id="Gruppieren 2" o:spid="_x0000_s1026" style="position:absolute;margin-left:-117.4pt;margin-top:-269.95pt;width:820.2pt;height:1429.9pt;z-index:-251655168;mso-width-relative:margin;mso-height-relative:margin" coordorigin="543,-26140" coordsize="104165,181600" o:gfxdata="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">
+                <v:shapetype id="_x0000_t75" coordsize="21600,21600" o:spt="75" o:preferrelative="t" path="m@4@5l@4@11@9@11@9@5xe" filled="f" stroked="f">
+                  <v:stroke joinstyle="miter"/>
+                  <v:formulas>
+                    <v:f eqn="if lineDrawn pixelLineWidth 0"/>
+                    <v:f eqn="sum @0 1 0"/>
+                    <v:f eqn="sum 0 0 @1"/>
+                    <v:f eqn="prod @2 1 2"/>
+                    <v:f eqn="prod @3 21600 pixelWidth"/>
+                    <v:f eqn="prod @3 21600 pixelHeight"/>
+                    <v:f eqn="sum @0 0 1"/>
+                    <v:f eqn="prod @6 1 2"/>
+                    <v:f eqn="prod @7 21600 pixelWidth"/>
+                    <v:f eqn="sum @8 21600 0"/>
+                    <v:f eqn="prod @7 21600 pixelHeight"/>
+                    <v:f eqn="sum @10 21600 0"/>
+                  </v:formulas>
+                  <v:path o:extrusionok="f" gradientshapeok="t" o:connecttype="rect"/>
+                  <o:lock v:ext="edit" aspectratio="t"/>
+                </v:shapetype>
+                <v:shape id="Grafik 1" o:spid="_x0000_s1027" type="#_x0000_t75" style="position:absolute;left:543;top:-26140;width:104165;height:181600;visibility:visible;mso-wrap-style:square" o:gfxdata="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">
+                  <v:imagedata r:id="rId11" o:title=""/>
+                </v:shape>
+                <v:shape id="Grafik 1" o:spid="_x0000_s1028" type="#_x0000_t75" style="position:absolute;left:9732;top:8464;width:11170;height:11176;visibility:visible;mso-wrap-style:square" o:gfxdata="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">
+                  <v:imagedata r:id="rId12" o:title=""/>
+                </v:shape>
+                <v:shape id="Grafik 2" o:spid="_x0000_s1029" type="#_x0000_t75" style="position:absolute;left:543;top:543;width:16929;height:16942;visibility:visible;mso-wrap-style:square" o:gfxdata="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">
+                  <v:imagedata r:id="rId13" o:title=""/>
+                </v:shape>
+              </v:group>
+            </w:pict>
+          </mc:Fallback>
+        </mc:AlternateContent>
+      </w:r>
       <w:r>
         <w:rPr>
           <w:noProof/>
@@ -56,6 +289,7 @@
                                 <w:rFonts w:ascii="Modern No. 20" w:hAnsi="Modern No. 20" w:cs="Arial"/>
                                 <w:b/>
                                 <w:bCs/>
+                                <w:color w:val="FFFFFF" w:themeColor="background1"/>
                                 <w:sz w:val="540"/>
                                 <w:szCs w:val="260"/>
                               </w:rPr>
@@ -65,6 +299,7 @@
                                 <w:rFonts w:ascii="Modern No. 20" w:hAnsi="Modern No. 20" w:cs="Arial"/>
                                 <w:b/>
                                 <w:bCs/>
+                                <w:color w:val="FFFFFF" w:themeColor="background1"/>
                                 <w:sz w:val="400"/>
                                 <w:szCs w:val="240"/>
                               </w:rPr>
@@ -104,6 +339,7 @@
                           <w:rFonts w:ascii="Modern No. 20" w:hAnsi="Modern No. 20" w:cs="Arial"/>
                           <w:b/>
                           <w:bCs/>
+                          <w:color w:val="FFFFFF" w:themeColor="background1"/>
                           <w:sz w:val="540"/>
                           <w:szCs w:val="260"/>
                         </w:rPr>
@@ -113,6 +349,7 @@
                           <w:rFonts w:ascii="Modern No. 20" w:hAnsi="Modern No. 20" w:cs="Arial"/>
                           <w:b/>
                           <w:bCs/>
+                          <w:color w:val="FFFFFF" w:themeColor="background1"/>
                           <w:sz w:val="400"/>
                           <w:szCs w:val="240"/>
                         </w:rPr>
@@ -135,7 +372,7 @@
         <mc:AlternateContent>
           <mc:Choice Requires="wpg">
             <w:drawing>
-              <wp:anchor distT="0" distB="0" distL="114300" distR="114300" simplePos="0" relativeHeight="251672576" behindDoc="0" locked="0" layoutInCell="1" allowOverlap="1" wp14:anchorId="33E3EE85" wp14:editId="569C6EA5">
+              <wp:anchor distT="0" distB="0" distL="114300" distR="114300" simplePos="0" relativeHeight="251672576" behindDoc="0" locked="0" layoutInCell="1" allowOverlap="1" wp14:anchorId="33E3EE85" wp14:editId="53620DFF">
                 <wp:simplePos x="0" y="0"/>
                 <wp:positionH relativeFrom="page">
                   <wp:align>right</wp:align>
@@ -155,9 +392,9 @@
                       <wpg:grpSpPr>
                         <a:xfrm>
                           <a:off x="0" y="0"/>
-                          <a:ext cx="10152332" cy="720000"/>
+                          <a:ext cx="10152331" cy="720000"/>
                           <a:chOff x="-1" y="-133350"/>
-                          <a:chExt cx="10152332" cy="720000"/>
+                          <a:chExt cx="10152331" cy="720000"/>
                         </a:xfrm>
                       </wpg:grpSpPr>
                       <wpg:grpSp>
@@ -166,7 +403,7 @@
                         <wpg:grpSpPr>
                           <a:xfrm>
                             <a:off x="-1" y="0"/>
-                            <a:ext cx="10152332" cy="558838"/>
+                            <a:ext cx="10152331" cy="558838"/>
                             <a:chOff x="-389509" y="782978"/>
                             <a:chExt cx="7981426" cy="559178"/>
                           </a:xfrm>
@@ -202,6 +439,7 @@
                                     <w:rFonts w:ascii="Modern No. 20" w:hAnsi="Modern No. 20"/>
                                     <w:b/>
                                     <w:bCs/>
+                                    <w:color w:val="FFFFFF" w:themeColor="background1"/>
                                     <w:sz w:val="56"/>
                                     <w:szCs w:val="56"/>
                                   </w:rPr>
@@ -211,20 +449,11 @@
                                     <w:rFonts w:ascii="Modern No. 20" w:hAnsi="Modern No. 20"/>
                                     <w:b/>
                                     <w:bCs/>
+                                    <w:color w:val="FFFFFF" w:themeColor="background1"/>
                                     <w:sz w:val="56"/>
                                     <w:szCs w:val="56"/>
                                   </w:rPr>
-                                  <w:t>FSV Treuen</w:t>
-                                </w:r>
-                                <w:r>
-                                  <w:rPr>
-                                    <w:rFonts w:ascii="Modern No. 20" w:hAnsi="Modern No. 20"/>
-                                    <w:b/>
-                                    <w:bCs/>
-                                    <w:sz w:val="56"/>
-                                    <w:szCs w:val="56"/>
-                                  </w:rPr>
-                                  <w:t xml:space="preserve"> </w:t>
+                                  <w:t xml:space="preserve">FSV Treuen </w:t>
                                 </w:r>
                               </w:p>
                               <w:p>
@@ -235,6 +464,7 @@
                                     <w:rFonts w:ascii="Modern No. 20" w:hAnsi="Modern No. 20"/>
                                     <w:b/>
                                     <w:bCs/>
+                                    <w:color w:val="FFFFFF" w:themeColor="background1"/>
                                     <w:sz w:val="56"/>
                                     <w:szCs w:val="56"/>
                                   </w:rPr>
@@ -276,6 +506,7 @@
                                     <w:rFonts w:ascii="Modern No. 20" w:hAnsi="Modern No. 20"/>
                                     <w:b/>
                                     <w:bCs/>
+                                    <w:color w:val="FFFFFF" w:themeColor="background1"/>
                                     <w:sz w:val="56"/>
                                     <w:szCs w:val="56"/>
                                   </w:rPr>
@@ -285,6 +516,7 @@
                                     <w:rFonts w:ascii="Modern No. 20" w:hAnsi="Modern No. 20"/>
                                     <w:b/>
                                     <w:bCs/>
+                                    <w:color w:val="FFFFFF" w:themeColor="background1"/>
                                     <w:sz w:val="56"/>
                                     <w:szCs w:val="56"/>
                                   </w:rPr>
@@ -299,6 +531,7 @@
                                     <w:rFonts w:ascii="Modern No. 20" w:hAnsi="Modern No. 20"/>
                                     <w:b/>
                                     <w:bCs/>
+                                    <w:color w:val="FFFFFF" w:themeColor="background1"/>
                                     <w:sz w:val="52"/>
                                     <w:szCs w:val="52"/>
                                   </w:rPr>
@@ -337,6 +570,7 @@
                                   <w:rFonts w:ascii="Modern No. 20" w:hAnsi="Modern No. 20"/>
                                   <w:b/>
                                   <w:bCs/>
+                                  <w:color w:val="FFFFFF" w:themeColor="background1"/>
                                   <w:sz w:val="96"/>
                                   <w:szCs w:val="96"/>
                                 </w:rPr>
@@ -346,6 +580,7 @@
                                   <w:rFonts w:ascii="Modern No. 20" w:hAnsi="Modern No. 20"/>
                                   <w:b/>
                                   <w:bCs/>
+                                  <w:color w:val="FFFFFF" w:themeColor="background1"/>
                                   <w:sz w:val="96"/>
                                   <w:szCs w:val="96"/>
                                 </w:rPr>
@@ -375,7 +610,7 @@
           </mc:Choice>
           <mc:Fallback>
             <w:pict>
-              <v:group w14:anchorId="33E3EE85" id="Gruppieren 6" o:spid="_x0000_s1027" style="position:absolute;margin-left:748.2pt;margin-top:885.35pt;width:799.4pt;height:56.7pt;z-index:251672576;mso-position-horizontal:right;mso-position-horizontal-relative:page;mso-width-relative:margin;mso-height-relative:margin" coordorigin=",-1333" coordsize="101523,7200" o:gfxdata="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">
+              <v:group w14:anchorId="33E3EE85" id="Gruppieren 6" o:spid="_x0000_s1027" style="position:absolute;margin-left:748.2pt;margin-top:885.35pt;width:799.4pt;height:56.7pt;z-index:251672576;mso-position-horizontal:right;mso-position-horizontal-relative:page;mso-width-relative:margin;mso-height-relative:margin" coordorigin=",-1333" coordsize="101523,7200" o:gfxdata="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">
                 <v:group id="Gruppieren 1" o:spid="_x0000_s1028" style="position:absolute;width:101523;height:5588" coordorigin="-3895,7829" coordsize="79814,5591" o:gfxdata="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">
                   <v:shape id="_x0000_s1029" type="#_x0000_t202" style="position:absolute;left:-3895;top:7829;width:36509;height:5404;visibility:visible;mso-wrap-style:square;v-text-anchor:top" o:gfxdata="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" filled="f" stroked="f">
                     <v:textbox>
@@ -388,6 +623,7 @@
                               <w:rFonts w:ascii="Modern No. 20" w:hAnsi="Modern No. 20"/>
                               <w:b/>
                               <w:bCs/>
+                              <w:color w:val="FFFFFF" w:themeColor="background1"/>
                               <w:sz w:val="56"/>
                               <w:szCs w:val="56"/>
                             </w:rPr>
@@ -397,20 +633,11 @@
                               <w:rFonts w:ascii="Modern No. 20" w:hAnsi="Modern No. 20"/>
                               <w:b/>
                               <w:bCs/>
+                              <w:color w:val="FFFFFF" w:themeColor="background1"/>
                               <w:sz w:val="56"/>
                               <w:szCs w:val="56"/>
                             </w:rPr>
-                            <w:t>FSV Treuen</w:t>
-                          </w:r>
-                          <w:r>
-                            <w:rPr>
-                              <w:rFonts w:ascii="Modern No. 20" w:hAnsi="Modern No. 20"/>
-                              <w:b/>
-                              <w:bCs/>
-                              <w:sz w:val="56"/>
-                              <w:szCs w:val="56"/>
-                            </w:rPr>
-                            <w:t xml:space="preserve"> </w:t>
+                            <w:t xml:space="preserve">FSV Treuen </w:t>
                           </w:r>
                         </w:p>
                         <w:p>
@@ -421,6 +648,7 @@
                               <w:rFonts w:ascii="Modern No. 20" w:hAnsi="Modern No. 20"/>
                               <w:b/>
                               <w:bCs/>
+                              <w:color w:val="FFFFFF" w:themeColor="background1"/>
                               <w:sz w:val="56"/>
                               <w:szCs w:val="56"/>
                             </w:rPr>
@@ -439,6 +667,7 @@
                               <w:rFonts w:ascii="Modern No. 20" w:hAnsi="Modern No. 20"/>
                               <w:b/>
                               <w:bCs/>
+                              <w:color w:val="FFFFFF" w:themeColor="background1"/>
                               <w:sz w:val="56"/>
                               <w:szCs w:val="56"/>
                             </w:rPr>
@@ -448,6 +677,7 @@
                               <w:rFonts w:ascii="Modern No. 20" w:hAnsi="Modern No. 20"/>
                               <w:b/>
                               <w:bCs/>
+                              <w:color w:val="FFFFFF" w:themeColor="background1"/>
                               <w:sz w:val="56"/>
                               <w:szCs w:val="56"/>
                             </w:rPr>
@@ -462,6 +692,7 @@
                               <w:rFonts w:ascii="Modern No. 20" w:hAnsi="Modern No. 20"/>
                               <w:b/>
                               <w:bCs/>
+                              <w:color w:val="FFFFFF" w:themeColor="background1"/>
                               <w:sz w:val="52"/>
                               <w:szCs w:val="52"/>
                             </w:rPr>
@@ -482,6 +713,7 @@
                             <w:rFonts w:ascii="Modern No. 20" w:hAnsi="Modern No. 20"/>
                             <w:b/>
                             <w:bCs/>
+                            <w:color w:val="FFFFFF" w:themeColor="background1"/>
                             <w:sz w:val="96"/>
                             <w:szCs w:val="96"/>
                           </w:rPr>
@@ -491,6 +723,7 @@
                             <w:rFonts w:ascii="Modern No. 20" w:hAnsi="Modern No. 20"/>
                             <w:b/>
                             <w:bCs/>
+                            <w:color w:val="FFFFFF" w:themeColor="background1"/>
                             <w:sz w:val="96"/>
                             <w:szCs w:val="96"/>
                           </w:rPr>
@@ -511,7 +744,7 @@
           <w:noProof/>
         </w:rPr>
         <w:drawing>
-          <wp:anchor distT="0" distB="0" distL="114300" distR="114300" simplePos="0" relativeHeight="251664384" behindDoc="0" locked="0" layoutInCell="1" allowOverlap="1" wp14:anchorId="73D19D37" wp14:editId="54EE28C2">
+          <wp:anchor distT="0" distB="0" distL="114300" distR="114300" simplePos="0" relativeHeight="251664384" behindDoc="0" locked="0" layoutInCell="1" allowOverlap="1" wp14:anchorId="73D19D37" wp14:editId="69B349D3">
             <wp:simplePos x="0" y="0"/>
             <wp:positionH relativeFrom="margin">
               <wp:posOffset>-762635</wp:posOffset>
@@ -536,7 +769,7 @@
                     </pic:cNvPicPr>
                   </pic:nvPicPr>
                   <pic:blipFill>
-                    <a:blip r:embed="rId7">
+                    <a:blip r:embed="rId10">
                       <a:extLst>
                         <a:ext uri="{28A0092B-C50C-407E-A947-70E740481C1C}">
                           <a14:useLocalDpi xmlns:a14="http://schemas.microsoft.com/office/drawing/2010/main" val="0"/>
@@ -576,7 +809,7 @@
           <w:noProof/>
         </w:rPr>
         <w:drawing>
-          <wp:anchor distT="0" distB="0" distL="114300" distR="114300" simplePos="0" relativeHeight="251666432" behindDoc="0" locked="0" layoutInCell="1" allowOverlap="1" wp14:anchorId="5FEE9DFB" wp14:editId="0002DF97">
+          <wp:anchor distT="0" distB="0" distL="114300" distR="114300" simplePos="0" relativeHeight="251666432" behindDoc="0" locked="0" layoutInCell="1" allowOverlap="1" wp14:anchorId="5FEE9DFB" wp14:editId="482DA5FC">
             <wp:simplePos x="0" y="0"/>
             <wp:positionH relativeFrom="margin">
               <wp:posOffset>5848350</wp:posOffset>
@@ -601,7 +834,7 @@
                     </pic:cNvPicPr>
                   </pic:nvPicPr>
                   <pic:blipFill>
-                    <a:blip r:embed="rId8">
+                    <a:blip r:embed="rId9">
                       <a:extLst>
                         <a:ext uri="{28A0092B-C50C-407E-A947-70E740481C1C}">
                           <a14:useLocalDpi xmlns:a14="http://schemas.microsoft.com/office/drawing/2010/main" val="0"/>
@@ -635,234 +868,6 @@
             </wp14:sizeRelV>
           </wp:anchor>
         </w:drawing>
-      </w:r>
-      <w:r>
-        <w:rPr>
-          <w:noProof/>
-        </w:rPr>
-        <w:drawing>
-          <wp:anchor distT="0" distB="0" distL="114300" distR="114300" simplePos="0" relativeHeight="251662336" behindDoc="0" locked="0" layoutInCell="1" allowOverlap="1" wp14:anchorId="0063501E" wp14:editId="172CF6AD">
-            <wp:simplePos x="0" y="0"/>
-            <wp:positionH relativeFrom="page">
-              <wp:align>right</wp:align>
-            </wp:positionH>
-            <wp:positionV relativeFrom="paragraph">
-              <wp:posOffset>-3400525</wp:posOffset>
-            </wp:positionV>
-            <wp:extent cx="10290810" cy="15435680"/>
-            <wp:effectExtent l="0" t="0" r="0" b="0"/>
-            <wp:wrapNone/>
-            <wp:docPr id="1037487974" name="Grafik 3"/>
-            <wp:cNvGraphicFramePr>
-              <a:graphicFrameLocks xmlns:a="http://schemas.openxmlformats.org/drawingml/2006/main" noChangeAspect="1"/>
-            </wp:cNvGraphicFramePr>
-            <a:graphic xmlns:a="http://schemas.openxmlformats.org/drawingml/2006/main">
-              <a:graphicData uri="http://schemas.openxmlformats.org/drawingml/2006/picture">
-                <pic:pic xmlns:pic="http://schemas.openxmlformats.org/drawingml/2006/picture">
-                  <pic:nvPicPr>
-                    <pic:cNvPr id="1037487974" name="Grafik 1037487974"/>
-                    <pic:cNvPicPr/>
-                  </pic:nvPicPr>
-                  <pic:blipFill>
-                    <a:blip r:embed="rId9">
-                      <a:alphaModFix amt="70000"/>
-                      <a:extLst>
-                        <a:ext uri="{28A0092B-C50C-407E-A947-70E740481C1C}">
-                          <a14:useLocalDpi xmlns:a14="http://schemas.microsoft.com/office/drawing/2010/main" val="0"/>
-                        </a:ext>
-                      </a:extLst>
-                    </a:blip>
-                    <a:stretch>
-                      <a:fillRect/>
-                    </a:stretch>
-                  </pic:blipFill>
-                  <pic:spPr>
-                    <a:xfrm>
-                      <a:off x="0" y="0"/>
-                      <a:ext cx="10290810" cy="15435680"/>
-                    </a:xfrm>
-                    <a:prstGeom prst="rect">
-                      <a:avLst/>
-                    </a:prstGeom>
-                  </pic:spPr>
-                </pic:pic>
-              </a:graphicData>
-            </a:graphic>
-            <wp14:sizeRelH relativeFrom="page">
-              <wp14:pctWidth>0</wp14:pctWidth>
-            </wp14:sizeRelH>
-            <wp14:sizeRelV relativeFrom="page">
-              <wp14:pctHeight>0</wp14:pctHeight>
-            </wp14:sizeRelV>
-          </wp:anchor>
-        </w:drawing>
-      </w:r>
-      <w:r>
-        <w:rPr>
-          <w:noProof/>
-        </w:rPr>
-        <mc:AlternateContent>
-          <mc:Choice Requires="wpg">
-            <w:drawing>
-              <wp:anchor distT="0" distB="0" distL="114300" distR="114300" simplePos="0" relativeHeight="251661312" behindDoc="1" locked="0" layoutInCell="1" allowOverlap="1" wp14:anchorId="095C5D59" wp14:editId="1B4B1E1A">
-                <wp:simplePos x="0" y="0"/>
-                <wp:positionH relativeFrom="column">
-                  <wp:posOffset>-1351035</wp:posOffset>
-                </wp:positionH>
-                <wp:positionV relativeFrom="paragraph">
-                  <wp:posOffset>-800182</wp:posOffset>
-                </wp:positionV>
-                <wp:extent cx="10271760" cy="12839700"/>
-                <wp:effectExtent l="0" t="0" r="0" b="0"/>
-                <wp:wrapNone/>
-                <wp:docPr id="277136787" name="Gruppieren 2"/>
-                <wp:cNvGraphicFramePr/>
-                <a:graphic xmlns:a="http://schemas.openxmlformats.org/drawingml/2006/main">
-                  <a:graphicData uri="http://schemas.microsoft.com/office/word/2010/wordprocessingGroup">
-                    <wpg:wgp>
-                      <wpg:cNvGrpSpPr/>
-                      <wpg:grpSpPr>
-                        <a:xfrm>
-                          <a:off x="0" y="0"/>
-                          <a:ext cx="10271760" cy="12839700"/>
-                          <a:chOff x="0" y="0"/>
-                          <a:chExt cx="10271760" cy="12839700"/>
-                        </a:xfrm>
-                      </wpg:grpSpPr>
-                      <pic:pic xmlns:pic="http://schemas.openxmlformats.org/drawingml/2006/picture">
-                        <pic:nvPicPr>
-                          <pic:cNvPr id="359774929" name="Grafik 1"/>
-                          <pic:cNvPicPr>
-                            <a:picLocks noChangeAspect="1"/>
-                          </pic:cNvPicPr>
-                        </pic:nvPicPr>
-                        <pic:blipFill>
-                          <a:blip r:embed="rId10">
-                            <a:extLst>
-                              <a:ext uri="{28A0092B-C50C-407E-A947-70E740481C1C}">
-                                <a14:useLocalDpi xmlns:a14="http://schemas.microsoft.com/office/drawing/2010/main" val="0"/>
-                              </a:ext>
-                            </a:extLst>
-                          </a:blip>
-                          <a:stretch>
-                            <a:fillRect/>
-                          </a:stretch>
-                        </pic:blipFill>
-                        <pic:spPr>
-                          <a:xfrm>
-                            <a:off x="0" y="0"/>
-                            <a:ext cx="10271760" cy="12839700"/>
-                          </a:xfrm>
-                          <a:prstGeom prst="rect">
-                            <a:avLst/>
-                          </a:prstGeom>
-                        </pic:spPr>
-                      </pic:pic>
-                      <pic:pic xmlns:pic="http://schemas.openxmlformats.org/drawingml/2006/picture">
-                        <pic:nvPicPr>
-                          <pic:cNvPr id="1883932303" name="Grafik 1"/>
-                          <pic:cNvPicPr>
-                            <a:picLocks noChangeAspect="1"/>
-                          </pic:cNvPicPr>
-                        </pic:nvPicPr>
-                        <pic:blipFill>
-                          <a:blip r:embed="rId8">
-                            <a:extLst>
-                              <a:ext uri="{28A0092B-C50C-407E-A947-70E740481C1C}">
-                                <a14:useLocalDpi xmlns:a14="http://schemas.microsoft.com/office/drawing/2010/main" val="0"/>
-                              </a:ext>
-                            </a:extLst>
-                          </a:blip>
-                          <a:stretch>
-                            <a:fillRect/>
-                          </a:stretch>
-                        </pic:blipFill>
-                        <pic:spPr>
-                          <a:xfrm>
-                            <a:off x="973248" y="846499"/>
-                            <a:ext cx="1116965" cy="1117600"/>
-                          </a:xfrm>
-                          <a:prstGeom prst="rect">
-                            <a:avLst/>
-                          </a:prstGeom>
-                          <a:ln>
-                            <a:noFill/>
-                          </a:ln>
-                        </pic:spPr>
-                      </pic:pic>
-                      <pic:pic xmlns:pic="http://schemas.openxmlformats.org/drawingml/2006/picture">
-                        <pic:nvPicPr>
-                          <pic:cNvPr id="1632319248" name="Grafik 2"/>
-                          <pic:cNvPicPr>
-                            <a:picLocks noChangeAspect="1"/>
-                          </pic:cNvPicPr>
-                        </pic:nvPicPr>
-                        <pic:blipFill>
-                          <a:blip r:embed="rId7">
-                            <a:extLst>
-                              <a:ext uri="{28A0092B-C50C-407E-A947-70E740481C1C}">
-                                <a14:useLocalDpi xmlns:a14="http://schemas.microsoft.com/office/drawing/2010/main" val="0"/>
-                              </a:ext>
-                            </a:extLst>
-                          </a:blip>
-                          <a:stretch>
-                            <a:fillRect/>
-                          </a:stretch>
-                        </pic:blipFill>
-                        <pic:spPr>
-                          <a:xfrm>
-                            <a:off x="54321" y="54321"/>
-                            <a:ext cx="1692910" cy="1694180"/>
-                          </a:xfrm>
-                          <a:prstGeom prst="rect">
-                            <a:avLst/>
-                          </a:prstGeom>
-                          <a:ln>
-                            <a:noFill/>
-                          </a:ln>
-                        </pic:spPr>
-                      </pic:pic>
-                    </wpg:wgp>
-                  </a:graphicData>
-                </a:graphic>
-              </wp:anchor>
-            </w:drawing>
-          </mc:Choice>
-          <mc:Fallback>
-            <w:pict>
-              <v:group w14:anchorId="1C3EE340" id="Gruppieren 2" o:spid="_x0000_s1026" style="position:absolute;margin-left:-106.4pt;margin-top:-63pt;width:808.8pt;height:1011pt;z-index:-251655168" coordsize="102717,128397" o:gfxdata="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">
-                <v:shapetype id="_x0000_t75" coordsize="21600,21600" o:spt="75" o:preferrelative="t" path="m@4@5l@4@11@9@11@9@5xe" filled="f" stroked="f">
-                  <v:stroke joinstyle="miter"/>
-                  <v:formulas>
-                    <v:f eqn="if lineDrawn pixelLineWidth 0"/>
-                    <v:f eqn="sum @0 1 0"/>
-                    <v:f eqn="sum 0 0 @1"/>
-                    <v:f eqn="prod @2 1 2"/>
-                    <v:f eqn="prod @3 21600 pixelWidth"/>
-                    <v:f eqn="prod @3 21600 pixelHeight"/>
-                    <v:f eqn="sum @0 0 1"/>
-                    <v:f eqn="prod @6 1 2"/>
-                    <v:f eqn="prod @7 21600 pixelWidth"/>
-                    <v:f eqn="sum @8 21600 0"/>
-                    <v:f eqn="prod @7 21600 pixelHeight"/>
-                    <v:f eqn="sum @10 21600 0"/>
-                  </v:formulas>
-                  <v:path o:extrusionok="f" gradientshapeok="t" o:connecttype="rect"/>
-                  <o:lock v:ext="edit" aspectratio="t"/>
-                </v:shapetype>
-                <v:shape id="Grafik 1" o:spid="_x0000_s1027" type="#_x0000_t75" style="position:absolute;width:102717;height:128397;visibility:visible;mso-wrap-style:square" o:gfxdata="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">
-                  <v:imagedata r:id="rId11" o:title=""/>
-                </v:shape>
-                <v:shape id="Grafik 1" o:spid="_x0000_s1028" type="#_x0000_t75" style="position:absolute;left:9732;top:8464;width:11170;height:11176;visibility:visible;mso-wrap-style:square" o:gfxdata="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">
-                  <v:imagedata r:id="rId12" o:title=""/>
-                </v:shape>
-                <v:shape id="Grafik 2" o:spid="_x0000_s1029" type="#_x0000_t75" style="position:absolute;left:543;top:543;width:16929;height:16942;visibility:visible;mso-wrap-style:square" o:gfxdata="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">
-                  <v:imagedata r:id="rId13" o:title=""/>
-                </v:shape>
-              </v:group>
-            </w:pict>
-          </mc:Fallback>
-        </mc:AlternateContent>
       </w:r>
     </w:p>
     <w:sectPr>

</xml_diff>